<commit_message>
Add Azure AI Foundry, OTLP telemetry, and FinOps bullets to CV
Highlights recent enterprise AI infrastructure work: governed AI
Foundry hub architecture at ColX, OTLP telemetry pipeline streaming
Claude 5 Sonnet/Fable 5 metrics into App Insights, and an Azure
Monitor -> Grafana cost/model-mix dashboard at Allica Bank. Also adds
a reusable Word-COM script for inserting/replacing bulleted
paragraphs in the DOCX while preserving list formatting.

Co-Authored-By: Claude Sonnet 5 <noreply@anthropic.com>
</commit_message>
<xml_diff>
--- a/Jay Freeman CV.docx
+++ b/Jay Freeman CV.docx
@@ -101,15 +101,7 @@
     </w:p>
     <w:p>
       <w:r>
-        <w:t xml:space="preserve">A senior </w:t>
-      </w:r>
-      <w:proofErr w:type="spellStart"/>
-      <w:r>
-        <w:t>DevSecOps</w:t>
-      </w:r>
-      <w:proofErr w:type="spellEnd"/>
-      <w:r>
-        <w:t xml:space="preserve"> Architect with over 25 years of experience leading teams and delivering complex, secure cloud modernisation solutions. Specialises in driving agile transformations that ensure projects are completed on time and within budget, consistently enhancing development practices and platform security.</w:t>
+        <w:t>A senior DevSecOps Architect with over 25 years of experience leading teams and delivering complex, secure cloud modernisation solutions. Specialises in driving agile transformations that ensure projects are completed on time and within budget, consistently enhancing development practices and platform security.</w:t>
       </w:r>
     </w:p>
     <w:p>
@@ -153,15 +145,7 @@
         <w:t xml:space="preserve">Azure Expertise: </w:t>
       </w:r>
       <w:r>
-        <w:t xml:space="preserve">VNET/Subnets, Traffic Manager, Azure </w:t>
-      </w:r>
-      <w:proofErr w:type="spellStart"/>
-      <w:r>
-        <w:t>FrontDoor</w:t>
-      </w:r>
-      <w:proofErr w:type="spellEnd"/>
-      <w:r>
-        <w:t>, Azure Entra ID, Network Security Group (NSG), Point-to-Site/Site-to-Site VPN, App Service Environment (ASE), Event Hubs, Function Apps, Logic apps, Azure Firewall, DNS Forwarding Rulesets, Azure Bastion Host, VPN Gateway, Service Fabric, APIM, Azure Policies, Express Route, Key Vault, Service Bus, Stream Analytics, Log Analytics, DNS Private Resolver, Managed DevOps Pools (MDOP), Container Apps (ACA), Container Registry (ACR).</w:t>
+        <w:t>VNET/Subnets, Traffic Manager, Azure FrontDoor, Azure Entra ID, Network Security Group (NSG), Point-to-Site/Site-to-Site VPN, App Service Environment (ASE), Event Hubs, Function Apps, Logic apps, Azure Firewall, DNS Forwarding Rulesets, Azure Bastion Host, VPN Gateway, Service Fabric, APIM, Azure Policies, Express Route, Key Vault, Service Bus, Stream Analytics, Log Analytics, DNS Private Resolver, Managed DevOps Pools (MDOP), Container Apps (ACA), Container Registry (ACR).</w:t>
       </w:r>
     </w:p>
     <w:p>
@@ -176,23 +160,7 @@
           <w:b/>
           <w:bCs/>
         </w:rPr>
-        <w:t xml:space="preserve">Security, </w:t>
-      </w:r>
-      <w:proofErr w:type="spellStart"/>
-      <w:r>
-        <w:rPr>
-          <w:b/>
-          <w:bCs/>
-        </w:rPr>
-        <w:t>DevSecOps</w:t>
-      </w:r>
-      <w:proofErr w:type="spellEnd"/>
-      <w:r>
-        <w:rPr>
-          <w:b/>
-          <w:bCs/>
-        </w:rPr>
-        <w:t xml:space="preserve"> &amp; Compliance: </w:t>
+        <w:t xml:space="preserve">Security, DevSecOps &amp; Compliance: </w:t>
       </w:r>
       <w:r>
         <w:t>Azure Sentinel, Defender for Cloud, RBAC, ISO 27001, Terraform, Bicep, ARM Templates, PowerShell, Azure DevOps (YAML pipelines), Octopus Deploy, Team City, GIT, Privileged Identity Management (PIM).</w:t>
@@ -231,23 +199,7 @@
         <w:t xml:space="preserve">Databases &amp; Data: </w:t>
       </w:r>
       <w:r>
-        <w:t xml:space="preserve">SQL Server, TSQL, Cosmos DB, Databricks (Spark/Scala, Unity </w:t>
-      </w:r>
-      <w:proofErr w:type="spellStart"/>
-      <w:r>
-        <w:t>Catalog</w:t>
-      </w:r>
-      <w:proofErr w:type="spellEnd"/>
-      <w:r>
-        <w:t xml:space="preserve">), Azure Data Factory, </w:t>
-      </w:r>
-      <w:proofErr w:type="spellStart"/>
-      <w:r>
-        <w:t>Datalakes</w:t>
-      </w:r>
-      <w:proofErr w:type="spellEnd"/>
-      <w:r>
-        <w:t>, Raven DB, MongoDB, Oracle.</w:t>
+        <w:t>SQL Server, TSQL, Cosmos DB, Databricks (Spark/Scala, Unity Catalog), Azure Data Factory, Datalakes, Raven DB, MongoDB, Oracle.</w:t>
       </w:r>
     </w:p>
     <w:p>
@@ -291,7 +243,6 @@
           <w:bCs/>
         </w:rPr>
       </w:pPr>
-      <w:proofErr w:type="spellStart"/>
       <w:r>
         <w:rPr>
           <w:b/>
@@ -299,7 +250,6 @@
         </w:rPr>
         <w:t>Colx</w:t>
       </w:r>
-      <w:proofErr w:type="spellEnd"/>
       <w:r>
         <w:rPr>
           <w:b/>
@@ -307,21 +257,12 @@
         </w:rPr>
         <w:t xml:space="preserve"> | </w:t>
       </w:r>
-      <w:proofErr w:type="spellStart"/>
-      <w:r>
-        <w:rPr>
-          <w:b/>
-          <w:bCs/>
-        </w:rPr>
-        <w:t>DevSecOps</w:t>
-      </w:r>
-      <w:proofErr w:type="spellEnd"/>
-      <w:r>
-        <w:rPr>
-          <w:b/>
-          <w:bCs/>
-        </w:rPr>
-        <w:t xml:space="preserve"> </w:t>
+      <w:r>
+        <w:rPr>
+          <w:b/>
+          <w:bCs/>
+        </w:rPr>
+        <w:t xml:space="preserve">DevSecOps </w:t>
       </w:r>
       <w:r>
         <w:rPr>
@@ -417,7 +358,11 @@
         </w:numPr>
       </w:pPr>
       <w:r>
-        <w:t>Designed and delivered end-to-end Azure Privileged Identity Management (PIM) governance, covering role tiers, eligibility, approval-gated activation and audit validation, backed by an operational runbook, to establish least-privilege access across the platform.</w:t>
+        <w:t xml:space="preserve">Designed and delivered end-to-end Azure Privileged Identity Management (PIM) governance, covering role tiers, eligibility, approval-gated activation and audit validation, </w:t>
+      </w:r>
+      <w:r>
+        <w:lastRenderedPageBreak/>
+        <w:t>backed by an operational runbook, to establish least-privilege access across the platform.</w:t>
       </w:r>
     </w:p>
     <w:p>
@@ -444,114 +389,13 @@
     </w:p>
     <w:p>
       <w:pPr>
-        <w:rPr>
-          <w:b/>
-          <w:bCs/>
-        </w:rPr>
-      </w:pPr>
-      <w:r>
-        <w:rPr>
-          <w:b/>
-          <w:bCs/>
-        </w:rPr>
-        <w:t>Barnett Waddingham</w:t>
-      </w:r>
-      <w:r>
-        <w:rPr>
-          <w:b/>
-          <w:bCs/>
-        </w:rPr>
-        <w:t xml:space="preserve"> | </w:t>
-      </w:r>
-      <w:proofErr w:type="spellStart"/>
-      <w:r>
-        <w:rPr>
-          <w:b/>
-          <w:bCs/>
-        </w:rPr>
-        <w:t>DevSecOps</w:t>
-      </w:r>
-      <w:proofErr w:type="spellEnd"/>
-      <w:r>
-        <w:rPr>
-          <w:b/>
-          <w:bCs/>
-        </w:rPr>
-        <w:t xml:space="preserve"> </w:t>
-      </w:r>
-      <w:r>
-        <w:rPr>
-          <w:b/>
-          <w:bCs/>
-        </w:rPr>
-        <w:t xml:space="preserve">Cloud </w:t>
-      </w:r>
-      <w:r>
-        <w:rPr>
-          <w:b/>
-          <w:bCs/>
-        </w:rPr>
-        <w:t>Consultant</w:t>
-      </w:r>
-      <w:r>
-        <w:rPr>
-          <w:b/>
-          <w:bCs/>
-        </w:rPr>
-        <w:t xml:space="preserve"> (</w:t>
-      </w:r>
-      <w:r>
-        <w:rPr>
-          <w:b/>
-          <w:bCs/>
-        </w:rPr>
-        <w:t xml:space="preserve">May </w:t>
-      </w:r>
-      <w:r>
-        <w:rPr>
-          <w:b/>
-          <w:bCs/>
-        </w:rPr>
-        <w:t>202</w:t>
-      </w:r>
-      <w:r>
-        <w:rPr>
-          <w:b/>
-          <w:bCs/>
-        </w:rPr>
-        <w:t>6</w:t>
-      </w:r>
-      <w:r>
-        <w:rPr>
-          <w:b/>
-          <w:bCs/>
-        </w:rPr>
-        <w:t xml:space="preserve"> – </w:t>
-      </w:r>
-      <w:r>
-        <w:rPr>
-          <w:b/>
-          <w:bCs/>
-        </w:rPr>
-        <w:t>August 2026</w:t>
-      </w:r>
-      <w:r>
-        <w:rPr>
-          <w:b/>
-          <w:bCs/>
-        </w:rPr>
-        <w:t>)</w:t>
-      </w:r>
-    </w:p>
-    <w:p>
-      <w:pPr>
         <w:numPr>
           <w:ilvl w:val="0"/>
           <w:numId w:val="36"/>
         </w:numPr>
       </w:pPr>
       <w:r>
-        <w:t xml:space="preserve">Delivering a SIPP and investment product to production.</w:t>
+        <w:t>Designed a governed Azure AI Foundry hub architecture, isolating multi-tenant environments with per-team projects and role-based access control, enabling teams to safely adopt frontier models including Claude 5 Sonnet and Fable 5 without compromising tenant isolation.</w:t>
       </w:r>
     </w:p>
     <w:p>
@@ -562,7 +406,99 @@
         </w:numPr>
       </w:pPr>
       <w:r>
-        <w:t xml:space="preserve">Working on a B2C platform, carrying out general Terraform work to stand up and secure a production environment.</w:t>
+        <w:t>Implemented a standard OTLP telemetry pipeline using the OpenTelemetry Collector to stream model-level metrics (input/output tokens, latency, error rates) from Claude 5 Sonnet and Fable 5 workloads into Application Insights and Log Analytics, giving engineering teams real-time observability into AI service health.</w:t>
+      </w:r>
+    </w:p>
+    <w:p>
+      <w:pPr>
+        <w:rPr>
+          <w:b/>
+          <w:bCs/>
+        </w:rPr>
+      </w:pPr>
+      <w:r>
+        <w:rPr>
+          <w:b/>
+          <w:bCs/>
+        </w:rPr>
+        <w:t>Barnett Waddingham</w:t>
+      </w:r>
+      <w:r>
+        <w:rPr>
+          <w:b/>
+          <w:bCs/>
+        </w:rPr>
+        <w:t xml:space="preserve"> | </w:t>
+      </w:r>
+      <w:r>
+        <w:rPr>
+          <w:b/>
+          <w:bCs/>
+        </w:rPr>
+        <w:t xml:space="preserve">DevSecOps </w:t>
+      </w:r>
+      <w:r>
+        <w:rPr>
+          <w:b/>
+          <w:bCs/>
+        </w:rPr>
+        <w:t xml:space="preserve">Cloud </w:t>
+      </w:r>
+      <w:r>
+        <w:rPr>
+          <w:b/>
+          <w:bCs/>
+        </w:rPr>
+        <w:t>Consultant</w:t>
+      </w:r>
+      <w:r>
+        <w:rPr>
+          <w:b/>
+          <w:bCs/>
+        </w:rPr>
+        <w:t xml:space="preserve"> (</w:t>
+      </w:r>
+      <w:r>
+        <w:rPr>
+          <w:b/>
+          <w:bCs/>
+        </w:rPr>
+        <w:t xml:space="preserve">May </w:t>
+      </w:r>
+      <w:r>
+        <w:rPr>
+          <w:b/>
+          <w:bCs/>
+        </w:rPr>
+        <w:t>202</w:t>
+      </w:r>
+      <w:r>
+        <w:rPr>
+          <w:b/>
+          <w:bCs/>
+        </w:rPr>
+        <w:t>6</w:t>
+      </w:r>
+      <w:r>
+        <w:rPr>
+          <w:b/>
+          <w:bCs/>
+        </w:rPr>
+        <w:t xml:space="preserve"> – </w:t>
+      </w:r>
+      <w:r>
+        <w:rPr>
+          <w:b/>
+          <w:bCs/>
+        </w:rPr>
+        <w:t>August 2026</w:t>
+      </w:r>
+      <w:r>
+        <w:rPr>
+          <w:b/>
+          <w:bCs/>
+        </w:rPr>
+        <w:t>)</w:t>
       </w:r>
     </w:p>
     <w:p>
@@ -573,108 +509,7 @@
         </w:numPr>
       </w:pPr>
       <w:r>
-        <w:t xml:space="preserve">Supporting the development teams with standards, patterns and best practices.</w:t>
-      </w:r>
-    </w:p>
-    <w:p>
-      <w:pPr>
-        <w:rPr>
-          <w:b/>
-          <w:bCs/>
-        </w:rPr>
-      </w:pPr>
-      <w:r>
-        <w:rPr>
-          <w:b/>
-          <w:bCs/>
-        </w:rPr>
-        <w:t>Allica Bank</w:t>
-      </w:r>
-      <w:r>
-        <w:rPr>
-          <w:b/>
-          <w:bCs/>
-        </w:rPr>
-        <w:t xml:space="preserve"> | </w:t>
-      </w:r>
-      <w:proofErr w:type="spellStart"/>
-      <w:r>
-        <w:rPr>
-          <w:b/>
-          <w:bCs/>
-        </w:rPr>
-        <w:t>DevSecOps</w:t>
-      </w:r>
-      <w:proofErr w:type="spellEnd"/>
-      <w:r>
-        <w:rPr>
-          <w:b/>
-          <w:bCs/>
-        </w:rPr>
-        <w:t xml:space="preserve"> </w:t>
-      </w:r>
-      <w:r>
-        <w:rPr>
-          <w:b/>
-          <w:bCs/>
-        </w:rPr>
-        <w:t xml:space="preserve">Cloud </w:t>
-      </w:r>
-      <w:r>
-        <w:rPr>
-          <w:b/>
-          <w:bCs/>
-        </w:rPr>
-        <w:t>Consultant</w:t>
-      </w:r>
-      <w:r>
-        <w:rPr>
-          <w:b/>
-          <w:bCs/>
-        </w:rPr>
-        <w:t xml:space="preserve"> (</w:t>
-      </w:r>
-      <w:r>
-        <w:rPr>
-          <w:b/>
-          <w:bCs/>
-        </w:rPr>
-        <w:t xml:space="preserve">May </w:t>
-      </w:r>
-      <w:r>
-        <w:rPr>
-          <w:b/>
-          <w:bCs/>
-        </w:rPr>
-        <w:t>202</w:t>
-      </w:r>
-      <w:r>
-        <w:rPr>
-          <w:b/>
-          <w:bCs/>
-        </w:rPr>
-        <w:t>6</w:t>
-      </w:r>
-      <w:r>
-        <w:rPr>
-          <w:b/>
-          <w:bCs/>
-        </w:rPr>
-        <w:t xml:space="preserve"> – </w:t>
-      </w:r>
-      <w:r>
-        <w:rPr>
-          <w:b/>
-          <w:bCs/>
-        </w:rPr>
-        <w:t>August 2026</w:t>
-      </w:r>
-      <w:r>
-        <w:rPr>
-          <w:b/>
-          <w:bCs/>
-        </w:rPr>
-        <w:t>)</w:t>
+        <w:t>Delivering a SIPP and investment product to production.</w:t>
       </w:r>
     </w:p>
     <w:p>
@@ -685,7 +520,7 @@
         </w:numPr>
       </w:pPr>
       <w:r>
-        <w:t xml:space="preserve">Updated and hardened Azure Policy definitions and assignments to strengthen governance and security posture.</w:t>
+        <w:t>Working on a B2C platform, carrying out general Terraform work to stand up and secure a production environment.</w:t>
       </w:r>
     </w:p>
     <w:p>
@@ -696,7 +531,99 @@
         </w:numPr>
       </w:pPr>
       <w:r>
-        <w:t xml:space="preserve">Implemented the Azure Verified Modules (AVM) Landing Zone pattern for management group creation, establishing a standardised hierarchy.</w:t>
+        <w:t>Supporting the development teams with standards, patterns and best practices.</w:t>
+      </w:r>
+    </w:p>
+    <w:p>
+      <w:pPr>
+        <w:rPr>
+          <w:b/>
+          <w:bCs/>
+        </w:rPr>
+      </w:pPr>
+      <w:r>
+        <w:rPr>
+          <w:b/>
+          <w:bCs/>
+        </w:rPr>
+        <w:t>Allica Bank</w:t>
+      </w:r>
+      <w:r>
+        <w:rPr>
+          <w:b/>
+          <w:bCs/>
+        </w:rPr>
+        <w:t xml:space="preserve"> | </w:t>
+      </w:r>
+      <w:r>
+        <w:rPr>
+          <w:b/>
+          <w:bCs/>
+        </w:rPr>
+        <w:t xml:space="preserve">DevSecOps </w:t>
+      </w:r>
+      <w:r>
+        <w:rPr>
+          <w:b/>
+          <w:bCs/>
+        </w:rPr>
+        <w:t xml:space="preserve">Cloud </w:t>
+      </w:r>
+      <w:r>
+        <w:rPr>
+          <w:b/>
+          <w:bCs/>
+        </w:rPr>
+        <w:t>Consultant</w:t>
+      </w:r>
+      <w:r>
+        <w:rPr>
+          <w:b/>
+          <w:bCs/>
+        </w:rPr>
+        <w:t xml:space="preserve"> (</w:t>
+      </w:r>
+      <w:r>
+        <w:rPr>
+          <w:b/>
+          <w:bCs/>
+        </w:rPr>
+        <w:t xml:space="preserve">May </w:t>
+      </w:r>
+      <w:r>
+        <w:rPr>
+          <w:b/>
+          <w:bCs/>
+        </w:rPr>
+        <w:t>202</w:t>
+      </w:r>
+      <w:r>
+        <w:rPr>
+          <w:b/>
+          <w:bCs/>
+        </w:rPr>
+        <w:t>6</w:t>
+      </w:r>
+      <w:r>
+        <w:rPr>
+          <w:b/>
+          <w:bCs/>
+        </w:rPr>
+        <w:t xml:space="preserve"> – </w:t>
+      </w:r>
+      <w:r>
+        <w:rPr>
+          <w:b/>
+          <w:bCs/>
+        </w:rPr>
+        <w:t>August 2026</w:t>
+      </w:r>
+      <w:r>
+        <w:rPr>
+          <w:b/>
+          <w:bCs/>
+        </w:rPr>
+        <w:t>)</w:t>
       </w:r>
     </w:p>
     <w:p>
@@ -707,7 +634,7 @@
         </w:numPr>
       </w:pPr>
       <w:r>
-        <w:t xml:space="preserve">Authored default policy sets aligning the environment with ISO 27001 and other regulatory standards.</w:t>
+        <w:t>Updated and hardened Azure Policy definitions and assignments to strengthen governance and security posture.</w:t>
       </w:r>
     </w:p>
     <w:p>
@@ -718,7 +645,7 @@
         </w:numPr>
       </w:pPr>
       <w:r>
-        <w:t xml:space="preserve">Advised on and helped establish AI best practices and guardrails for the safe adoption of Claude and Microsoft Copilot.</w:t>
+        <w:t>Implemented the Azure Verified Modules (AVM) Landing Zone pattern for management group creation, establishing a standardised hierarchy.</w:t>
       </w:r>
     </w:p>
     <w:p>
@@ -729,99 +656,7 @@
         </w:numPr>
       </w:pPr>
       <w:r>
-        <w:t xml:space="preserve">Set up Azure monitoring and reporting to track AI agent usage and cost.</w:t>
-      </w:r>
-    </w:p>
-    <w:p>
-      <w:pPr>
-        <w:rPr>
-          <w:b/>
-          <w:bCs/>
-        </w:rPr>
-      </w:pPr>
-      <w:r>
-        <w:rPr>
-          <w:b/>
-          <w:bCs/>
-        </w:rPr>
-        <w:t>Cloud Direct / Drop Table</w:t>
-      </w:r>
-      <w:r>
-        <w:rPr>
-          <w:b/>
-          <w:bCs/>
-        </w:rPr>
-        <w:t xml:space="preserve"> | </w:t>
-      </w:r>
-      <w:r>
-        <w:rPr>
-          <w:b/>
-          <w:bCs/>
-        </w:rPr>
-        <w:t xml:space="preserve">Senior </w:t>
-      </w:r>
-      <w:r>
-        <w:rPr>
-          <w:b/>
-          <w:bCs/>
-        </w:rPr>
-        <w:t xml:space="preserve">Cloud </w:t>
-      </w:r>
-      <w:r>
-        <w:rPr>
-          <w:b/>
-          <w:bCs/>
-        </w:rPr>
-        <w:t>Consultant</w:t>
-      </w:r>
-      <w:r>
-        <w:rPr>
-          <w:b/>
-          <w:bCs/>
-        </w:rPr>
-        <w:t xml:space="preserve"> (</w:t>
-      </w:r>
-      <w:r>
-        <w:rPr>
-          <w:b/>
-          <w:bCs/>
-        </w:rPr>
-        <w:t>December</w:t>
-      </w:r>
-      <w:r>
-        <w:rPr>
-          <w:b/>
-          <w:bCs/>
-        </w:rPr>
-        <w:t xml:space="preserve"> 202</w:t>
-      </w:r>
-      <w:r>
-        <w:rPr>
-          <w:b/>
-          <w:bCs/>
-        </w:rPr>
-        <w:t>5</w:t>
-      </w:r>
-      <w:r>
-        <w:rPr>
-          <w:b/>
-          <w:bCs/>
-        </w:rPr>
-        <w:t xml:space="preserve"> – </w:t>
-      </w:r>
-      <w:r>
-        <w:rPr>
-          <w:b/>
-          <w:bCs/>
-        </w:rPr>
-        <w:t>March 2026</w:t>
-      </w:r>
-      <w:r>
-        <w:rPr>
-          <w:b/>
-          <w:bCs/>
-        </w:rPr>
-        <w:t>)</w:t>
+        <w:t>Authored default policy sets aligning the environment with ISO 27001 and other regulatory standards.</w:t>
       </w:r>
     </w:p>
     <w:p>
@@ -832,8 +667,7 @@
         </w:numPr>
       </w:pPr>
       <w:r>
-        <w:lastRenderedPageBreak/>
-        <w:t>Spearheaded the architecture and deployment of enterprise-grade Azure Cloud Landing Zones for a diverse portfolio of clients, leveraging the Azure Verified Modules (AVM) framework to ensure best-practice compliance and standardization.</w:t>
+        <w:t>Advised on and helped establish AI best practices and guardrails for the safe adoption of Claude and Microsoft Copilot.</w:t>
       </w:r>
     </w:p>
     <w:p>
@@ -844,15 +678,99 @@
         </w:numPr>
       </w:pPr>
       <w:r>
-        <w:t>Driven the adoption of modular Infrastructure as Code (</w:t>
-      </w:r>
-      <w:proofErr w:type="spellStart"/>
-      <w:r>
-        <w:t>IaC</w:t>
-      </w:r>
-      <w:proofErr w:type="spellEnd"/>
-      <w:r>
-        <w:t>) strategies to accelerate deployment timelines while maintaining strict security and governance controls.</w:t>
+        <w:t>Connected Azure Monitor cost and usage data to Grafana to build unified dashboards tracking model-mix drift and per-team AI spend, giving finance and engineering stakeholders shared visibility into API cost drivers and control over budget overruns.</w:t>
+      </w:r>
+    </w:p>
+    <w:p>
+      <w:pPr>
+        <w:rPr>
+          <w:b/>
+          <w:bCs/>
+        </w:rPr>
+      </w:pPr>
+      <w:r>
+        <w:rPr>
+          <w:b/>
+          <w:bCs/>
+        </w:rPr>
+        <w:t>Cloud Direct / Drop Table</w:t>
+      </w:r>
+      <w:r>
+        <w:rPr>
+          <w:b/>
+          <w:bCs/>
+        </w:rPr>
+        <w:t xml:space="preserve"> | </w:t>
+      </w:r>
+      <w:r>
+        <w:rPr>
+          <w:b/>
+          <w:bCs/>
+        </w:rPr>
+        <w:t xml:space="preserve">Senior </w:t>
+      </w:r>
+      <w:r>
+        <w:rPr>
+          <w:b/>
+          <w:bCs/>
+        </w:rPr>
+        <w:t xml:space="preserve">Cloud </w:t>
+      </w:r>
+      <w:r>
+        <w:rPr>
+          <w:b/>
+          <w:bCs/>
+        </w:rPr>
+        <w:t>Consultant</w:t>
+      </w:r>
+      <w:r>
+        <w:rPr>
+          <w:b/>
+          <w:bCs/>
+        </w:rPr>
+        <w:t xml:space="preserve"> (</w:t>
+      </w:r>
+      <w:r>
+        <w:rPr>
+          <w:b/>
+          <w:bCs/>
+        </w:rPr>
+        <w:t>December</w:t>
+      </w:r>
+      <w:r>
+        <w:rPr>
+          <w:b/>
+          <w:bCs/>
+        </w:rPr>
+        <w:t xml:space="preserve"> 202</w:t>
+      </w:r>
+      <w:r>
+        <w:rPr>
+          <w:b/>
+          <w:bCs/>
+        </w:rPr>
+        <w:t>5</w:t>
+      </w:r>
+      <w:r>
+        <w:rPr>
+          <w:b/>
+          <w:bCs/>
+        </w:rPr>
+        <w:t xml:space="preserve"> – </w:t>
+      </w:r>
+      <w:r>
+        <w:rPr>
+          <w:b/>
+          <w:bCs/>
+        </w:rPr>
+        <w:t>March 2026</w:t>
+      </w:r>
+      <w:r>
+        <w:rPr>
+          <w:b/>
+          <w:bCs/>
+        </w:rPr>
+        <w:t>)</w:t>
       </w:r>
     </w:p>
     <w:p>
@@ -863,6 +781,28 @@
         </w:numPr>
       </w:pPr>
       <w:r>
+        <w:t>Spearheaded the architecture and deployment of enterprise-grade Azure Cloud Landing Zones for a diverse portfolio of clients, leveraging the Azure Verified Modules (AVM) framework to ensure best-practice compliance and standardization.</w:t>
+      </w:r>
+    </w:p>
+    <w:p>
+      <w:pPr>
+        <w:numPr>
+          <w:ilvl w:val="0"/>
+          <w:numId w:val="36"/>
+        </w:numPr>
+      </w:pPr>
+      <w:r>
+        <w:t>Driven the adoption of modular Infrastructure as Code (IaC) strategies to accelerate deployment timelines while maintaining strict security and governance controls.</w:t>
+      </w:r>
+    </w:p>
+    <w:p>
+      <w:pPr>
+        <w:numPr>
+          <w:ilvl w:val="0"/>
+          <w:numId w:val="36"/>
+        </w:numPr>
+      </w:pPr>
+      <w:r>
         <w:t>Provided expert consultancy on cloud modernization strategies, translating complex business requirements into scalable, secure, and resilient cloud architectures.</w:t>
       </w:r>
     </w:p>
@@ -925,6 +865,7 @@
         </w:numPr>
       </w:pPr>
       <w:r>
+        <w:lastRenderedPageBreak/>
         <w:t>Developed and standardised a suite of reusable YAML pipelines and Terraform modules, enabling development teams to self-serve infrastructure and reduce new project setup time from weeks to hours.</w:t>
       </w:r>
     </w:p>
@@ -973,15 +914,7 @@
         </w:numPr>
       </w:pPr>
       <w:r>
-        <w:t xml:space="preserve">Automated 100% of the platform's infrastructure, including the end-to-end deployment of Databricks and Unity </w:t>
-      </w:r>
-      <w:proofErr w:type="spellStart"/>
-      <w:r>
-        <w:t>Catalog</w:t>
-      </w:r>
-      <w:proofErr w:type="spellEnd"/>
-      <w:r>
-        <w:t xml:space="preserve"> with RBAC policies that replicated user and group permissions from Microsoft Entra ID.</w:t>
+        <w:t>Automated 100% of the platform's infrastructure, including the end-to-end deployment of Databricks and Unity Catalog with RBAC policies that replicated user and group permissions from Microsoft Entra ID.</w:t>
       </w:r>
     </w:p>
     <w:p>
@@ -991,37 +924,12 @@
           <w:bCs/>
         </w:rPr>
       </w:pPr>
-      <w:proofErr w:type="spellStart"/>
-      <w:r>
-        <w:rPr>
-          <w:b/>
-          <w:bCs/>
-        </w:rPr>
-        <w:t>Premfina</w:t>
-      </w:r>
-      <w:proofErr w:type="spellEnd"/>
-      <w:r>
-        <w:rPr>
-          <w:b/>
-          <w:bCs/>
-        </w:rPr>
-        <w:t xml:space="preserve"> | </w:t>
-      </w:r>
-      <w:proofErr w:type="spellStart"/>
-      <w:r>
-        <w:rPr>
-          <w:b/>
-          <w:bCs/>
-        </w:rPr>
-        <w:t>DevSecOps</w:t>
-      </w:r>
-      <w:proofErr w:type="spellEnd"/>
-      <w:r>
-        <w:rPr>
-          <w:b/>
-          <w:bCs/>
-        </w:rPr>
-        <w:t xml:space="preserve"> Architect (March 2023 – August 2024)</w:t>
+      <w:r>
+        <w:rPr>
+          <w:b/>
+          <w:bCs/>
+        </w:rPr>
+        <w:t>Premfina | DevSecOps Architect (March 2023 – August 2024)</w:t>
       </w:r>
     </w:p>
     <w:p>
@@ -1043,15 +951,7 @@
         </w:numPr>
       </w:pPr>
       <w:r>
-        <w:t xml:space="preserve">Established the company's </w:t>
-      </w:r>
-      <w:proofErr w:type="spellStart"/>
-      <w:r>
-        <w:t>DevSecOps</w:t>
-      </w:r>
-      <w:proofErr w:type="spellEnd"/>
-      <w:r>
-        <w:t xml:space="preserve"> function, defining security best practices and PCI DSS compliance standards, and creating a library of reusable Bicep modules that enabled developers to self-serve infrastructure for over 50 microservices.</w:t>
+        <w:t>Established the company's DevSecOps function, defining security best practices and PCI DSS compliance standards, and creating a library of reusable Bicep modules that enabled developers to self-serve infrastructure for over 50 microservices.</w:t>
       </w:r>
     </w:p>
     <w:p>
@@ -1088,11 +988,7 @@
         </w:numPr>
       </w:pPr>
       <w:r>
-        <w:t xml:space="preserve">Architected and led the development of a secure data migration solution, a major component of the company's cloud modernisation, to move millions of customer </w:t>
-      </w:r>
-      <w:r>
-        <w:lastRenderedPageBreak/>
-        <w:t>records from legacy systems into Microsoft Dynamics, utilising Azure Functions, Service Bus, and Databricks.</w:t>
+        <w:t>Architected and led the development of a secure data migration solution, a major component of the company's cloud modernisation, to move millions of customer records from legacy systems into Microsoft Dynamics, utilising Azure Functions, Service Bus, and Databricks.</w:t>
       </w:r>
     </w:p>
     <w:p>
@@ -1103,15 +999,7 @@
         </w:numPr>
       </w:pPr>
       <w:r>
-        <w:t xml:space="preserve">Owned the </w:t>
-      </w:r>
-      <w:proofErr w:type="spellStart"/>
-      <w:r>
-        <w:t>DevSecOps</w:t>
-      </w:r>
-      <w:proofErr w:type="spellEnd"/>
-      <w:r>
-        <w:t xml:space="preserve"> lifecycle, creating all build and deployment pipelines in Azure DevOps with reusable YAML templates and defining security protocols for handling PII data in adherence with GDPR regulations.</w:t>
+        <w:t>Owned the DevSecOps lifecycle, creating all build and deployment pipelines in Azure DevOps with reusable YAML templates and defining security protocols for handling PII data in adherence with GDPR regulations.</w:t>
       </w:r>
     </w:p>
     <w:p>
@@ -1151,21 +1039,12 @@
           <w:bCs/>
         </w:rPr>
       </w:pPr>
-      <w:proofErr w:type="spellStart"/>
-      <w:r>
-        <w:rPr>
-          <w:b/>
-          <w:bCs/>
-        </w:rPr>
-        <w:t>Packt</w:t>
-      </w:r>
-      <w:proofErr w:type="spellEnd"/>
-      <w:r>
-        <w:rPr>
-          <w:b/>
-          <w:bCs/>
-        </w:rPr>
-        <w:t xml:space="preserve"> Publishing (2021-2022): </w:t>
+      <w:r>
+        <w:rPr>
+          <w:b/>
+          <w:bCs/>
+        </w:rPr>
+        <w:t xml:space="preserve">Packt Publishing (2021-2022): </w:t>
       </w:r>
       <w:r>
         <w:t>Served as Technical Reviewer for 'Hands-on Azure for Developers - Second Edition'.</w:t>
@@ -1196,21 +1075,13 @@
           <w:numId w:val="35"/>
         </w:numPr>
       </w:pPr>
-      <w:proofErr w:type="spellStart"/>
-      <w:r>
-        <w:rPr>
-          <w:b/>
-          <w:bCs/>
-        </w:rPr>
-        <w:t>PurpleBricks</w:t>
-      </w:r>
-      <w:proofErr w:type="spellEnd"/>
-      <w:r>
-        <w:rPr>
-          <w:b/>
-          <w:bCs/>
-        </w:rPr>
-        <w:t xml:space="preserve"> (2019-2020): </w:t>
+      <w:r>
+        <w:rPr>
+          <w:b/>
+          <w:bCs/>
+        </w:rPr>
+        <w:lastRenderedPageBreak/>
+        <w:t xml:space="preserve">PurpleBricks (2019-2020): </w:t>
       </w:r>
       <w:r>
         <w:t>Led the transformation of a brownfield Azure infrastructure by defining new standards for ARM Templates, Blueprints, and Policies.</w:t>
@@ -1249,15 +1120,7 @@
         <w:t xml:space="preserve">Concentra Analytics (2019): </w:t>
       </w:r>
       <w:r>
-        <w:t>As DevOps Lead, designed and delivered a secure, automated build and release pipeline, enabling one-click infrastructure deployment using ARM templates and securing infrastructure with VNETs/</w:t>
-      </w:r>
-      <w:proofErr w:type="spellStart"/>
-      <w:r>
-        <w:t>SubNets</w:t>
-      </w:r>
-      <w:proofErr w:type="spellEnd"/>
-      <w:r>
-        <w:t xml:space="preserve"> and NSGs.</w:t>
+        <w:t>As DevOps Lead, designed and delivered a secure, automated build and release pipeline, enabling one-click infrastructure deployment using ARM templates and securing infrastructure with VNETs/SubNets and NSGs.</w:t>
       </w:r>
     </w:p>
     <w:p>
@@ -1294,23 +1157,7 @@
           <w:b/>
           <w:bCs/>
         </w:rPr>
-        <w:t xml:space="preserve">ASOS &amp; Sports Direct (for </w:t>
-      </w:r>
-      <w:proofErr w:type="spellStart"/>
-      <w:r>
-        <w:rPr>
-          <w:b/>
-          <w:bCs/>
-        </w:rPr>
-        <w:t>Elastacloud</w:t>
-      </w:r>
-      <w:proofErr w:type="spellEnd"/>
-      <w:r>
-        <w:rPr>
-          <w:b/>
-          <w:bCs/>
-        </w:rPr>
-        <w:t xml:space="preserve">) (2018): </w:t>
+        <w:t xml:space="preserve">ASOS &amp; Sports Direct (for Elastacloud) (2018): </w:t>
       </w:r>
       <w:r>
         <w:t>As Tech Lead, architected and developed big data strategies for major retail clients.</w:t>

</xml_diff>

<commit_message>
Turn CV DOCX tooling into proper Claude Code skills and sync bullet wording
Moves the DOCX<->Markdown CV workflows from .github/skills (a location
Claude Code never scanned) into real, direction-named skills under
.claude/skills/: cv-docx-to-md and cv-md-to-docx. Consolidates their
scripts into a shared repo-root scripts/ folder instead of duplicating
them per-skill, adds a shared Word-COM-automation reference doc, and
adds a matching GitHub Copilot prompt file for each direction. Also
syncs the DOCX's Terraform-modules bullet to match the wording already
committed to the Markdown CV.

Co-Authored-By: Claude Sonnet 5 <noreply@anthropic.com>
</commit_message>
<xml_diff>
--- a/Jay Freeman CV.docx
+++ b/Jay Freeman CV.docx
@@ -347,7 +347,7 @@
         </w:numPr>
       </w:pPr>
       <w:r>
-        <w:t>Built and published a shared library of 14 reusable Terraform modules (hub networking, DNS Private Resolver, Key Vault, VPN Gateway, Managed DevOps Pools, Dev Center, Container Registry and more), plus a standalone Azure DevOps pipeline-templates repository, enabling teams to self-serve infrastructure consistently.</w:t>
+        <w:t>Built and published a shared library of re-useable Terraform modules plus a standalone Azure DevOps pipeline-templates repository, enabling teams to self-serve infrastructure consistently.</w:t>
       </w:r>
     </w:p>
     <w:p>
@@ -803,6 +803,7 @@
         </w:numPr>
       </w:pPr>
       <w:r>
+        <w:lastRenderedPageBreak/>
         <w:t>Provided expert consultancy on cloud modernization strategies, translating complex business requirements into scalable, secure, and resilient cloud architectures.</w:t>
       </w:r>
     </w:p>
@@ -865,7 +866,6 @@
         </w:numPr>
       </w:pPr>
       <w:r>
-        <w:lastRenderedPageBreak/>
         <w:t>Developed and standardised a suite of reusable YAML pipelines and Terraform modules, enabling development teams to self-serve infrastructure and reduce new project setup time from weeks to hours.</w:t>
       </w:r>
     </w:p>
@@ -1010,6 +1010,7 @@
         </w:numPr>
       </w:pPr>
       <w:r>
+        <w:lastRenderedPageBreak/>
         <w:t>Championed agile adoption by training stakeholders and development teams, establishing sprint ceremonies and introducing "brown paper bag" sessions to foster a culture of knowledge sharing.</w:t>
       </w:r>
     </w:p>
@@ -1080,7 +1081,6 @@
           <w:b/>
           <w:bCs/>
         </w:rPr>
-        <w:lastRenderedPageBreak/>
         <w:t xml:space="preserve">PurpleBricks (2019-2020): </w:t>
       </w:r>
       <w:r>

</xml_diff>